<commit_message>
IOM lab 2: follow the lab's code style and lab 1's GUI structure
Co-Authored-By: Claude Opus 5.5 <noreply@anthropic.com>
Claude-Session: https://claude.ai/code/session_01A12TLfEZbTus2PcwqKDioh
</commit_message>
<xml_diff>
--- a/iom/lab2/L2_TimpScurt.docx
+++ b/iom/lab2/L2_TimpScurt.docx
@@ -2249,7 +2249,7 @@
             <w:r>
               <w:drawing>
                 <wp:inline distT="0" distB="0" distL="0" distR="0">
-                  <wp:extent cx="5029200" cy="2011680"/>
+                  <wp:extent cx="4572000" cy="2286000"/>
                   <wp:docPr id="2001" name="grafic_a.png"/>
                   <a:graphic xmlns:a="http://schemas.openxmlformats.org/drawingml/2006/main">
                     <a:graphicData uri="http://schemas.openxmlformats.org/drawingml/2006/picture">
@@ -2267,7 +2267,7 @@
                         <pic:spPr>
                           <a:xfrm>
                             <a:off x="0" y="0"/>
-                            <a:ext cx="5029200" cy="2011680"/>
+                            <a:ext cx="4572000" cy="2286000"/>
                           </a:xfrm>
                           <a:prstGeom prst="rect">
                             <a:avLst/>
@@ -2393,7 +2393,7 @@
             <w:r>
               <w:drawing>
                 <wp:inline distT="0" distB="0" distL="0" distR="0">
-                  <wp:extent cx="5029200" cy="2011680"/>
+                  <wp:extent cx="4572000" cy="2286000"/>
                   <wp:docPr id="2002" name="grafic_s.png"/>
                   <a:graphic xmlns:a="http://schemas.openxmlformats.org/drawingml/2006/main">
                     <a:graphicData uri="http://schemas.openxmlformats.org/drawingml/2006/picture">
@@ -2411,7 +2411,7 @@
                         <pic:spPr>
                           <a:xfrm>
                             <a:off x="0" y="0"/>
-                            <a:ext cx="5029200" cy="2011680"/>
+                            <a:ext cx="4572000" cy="2286000"/>
                           </a:xfrm>
                           <a:prstGeom prst="rect">
                             <a:avLst/>
@@ -2570,7 +2570,7 @@
                 <w:sz w:val="24"/>
                 <w:szCs w:val="24"/>
               </w:rPr>
-              <w:t>Ea = 6,69 ; Za = 0,244 ; Ra = 0,70 (R(k)/R(0), maxim la k = 29 → F0 ≈ 276 Hz);</w:t>
+              <w:t>Ea = 6,69 ; Za = 0,244 ; Ra = maxim la k = 29 → F0 = 8000/29 ≈ 276 Hz;</w:t>
             </w:r>
           </w:p>
           <w:p>
@@ -2596,7 +2596,7 @@
                 <w:sz w:val="24"/>
                 <w:szCs w:val="24"/>
               </w:rPr>
-              <w:t>Es = 0,018 ; Zs = 0,425 ; Rs = 0,14 (fără maxim clar → fonem nesonor);</w:t>
+              <w:t>Es = 0,018 ; Zs = 0,425 ; Rs = fără maxime clare (fonem nesonor);</w:t>
             </w:r>
           </w:p>
         </w:tc>
@@ -2700,7 +2700,52 @@
                 <w:sz w:val="20"/>
                 <w:szCs w:val="20"/>
               </w:rPr>
-              <w:t xml:space="preserve">    return np.sum(x**2)</w:t>
+              <w:t xml:space="preserve">    E = 0</w:t>
+            </w:r>
+          </w:p>
+          <w:p>
+            <w:pPr>
+              <w:pStyle w:val="Normal"/>
+              <w:spacing w:before="0" w:after="0"/>
+              <w:ind w:start="417"/>
+            </w:pPr>
+            <w:r>
+              <w:rPr>
+                <w:rFonts w:ascii="Courier New" w:hAnsi="Courier New" w:cs="Courier New"/>
+                <w:sz w:val="20"/>
+                <w:szCs w:val="20"/>
+              </w:rPr>
+              <w:t xml:space="preserve">    for m in range(len(x)):</w:t>
+            </w:r>
+          </w:p>
+          <w:p>
+            <w:pPr>
+              <w:pStyle w:val="Normal"/>
+              <w:spacing w:before="0" w:after="0"/>
+              <w:ind w:start="417"/>
+            </w:pPr>
+            <w:r>
+              <w:rPr>
+                <w:rFonts w:ascii="Courier New" w:hAnsi="Courier New" w:cs="Courier New"/>
+                <w:sz w:val="20"/>
+                <w:szCs w:val="20"/>
+              </w:rPr>
+              <w:t xml:space="preserve">        E = E + x[m]**2</w:t>
+            </w:r>
+          </w:p>
+          <w:p>
+            <w:pPr>
+              <w:pStyle w:val="Normal"/>
+              <w:spacing w:before="0" w:after="0"/>
+              <w:ind w:start="417"/>
+            </w:pPr>
+            <w:r>
+              <w:rPr>
+                <w:rFonts w:ascii="Courier New" w:hAnsi="Courier New" w:cs="Courier New"/>
+                <w:sz w:val="20"/>
+                <w:szCs w:val="20"/>
+              </w:rPr>
+              <w:t xml:space="preserve">    return E</w:t>
             </w:r>
           </w:p>
           <w:p>
@@ -2756,7 +2801,7 @@
                 <w:sz w:val="20"/>
                 <w:szCs w:val="20"/>
               </w:rPr>
-              <w:t xml:space="preserve">    # fereastra dreptunghiulara w(n) = 1/(2N)</w:t>
+              <w:t xml:space="preserve">    Z = 0</w:t>
             </w:r>
           </w:p>
           <w:p>
@@ -2771,7 +2816,37 @@
                 <w:sz w:val="20"/>
                 <w:szCs w:val="20"/>
               </w:rPr>
-              <w:t xml:space="preserve">    return np.sum(np.abs(np.diff(np.sign(x)))) / (2 * len(x))</w:t>
+              <w:t xml:space="preserve">    for m in range(1, len(x)):</w:t>
+            </w:r>
+          </w:p>
+          <w:p>
+            <w:pPr>
+              <w:pStyle w:val="Normal"/>
+              <w:spacing w:before="0" w:after="0"/>
+              <w:ind w:start="417"/>
+            </w:pPr>
+            <w:r>
+              <w:rPr>
+                <w:rFonts w:ascii="Courier New" w:hAnsi="Courier New" w:cs="Courier New"/>
+                <w:sz w:val="20"/>
+                <w:szCs w:val="20"/>
+              </w:rPr>
+              <w:t xml:space="preserve">        Z = Z + abs(np.sign(x[m]) - np.sign(x[m-1]))</w:t>
+            </w:r>
+          </w:p>
+          <w:p>
+            <w:pPr>
+              <w:pStyle w:val="Normal"/>
+              <w:spacing w:before="0" w:after="0"/>
+              <w:ind w:start="417"/>
+            </w:pPr>
+            <w:r>
+              <w:rPr>
+                <w:rFonts w:ascii="Courier New" w:hAnsi="Courier New" w:cs="Courier New"/>
+                <w:sz w:val="20"/>
+                <w:szCs w:val="20"/>
+              </w:rPr>
+              <w:t xml:space="preserve">    return Z / (2 * len(x))</w:t>
             </w:r>
           </w:p>
           <w:p>
@@ -2872,7 +2947,22 @@
                 <w:sz w:val="20"/>
                 <w:szCs w:val="20"/>
               </w:rPr>
-              <w:t xml:space="preserve">        R[k] = np.sum(x[0:N-k] * x[k:N])</w:t>
+              <w:t xml:space="preserve">        for m in range(N - k):</w:t>
+            </w:r>
+          </w:p>
+          <w:p>
+            <w:pPr>
+              <w:pStyle w:val="Normal"/>
+              <w:spacing w:before="0" w:after="0"/>
+              <w:ind w:start="417"/>
+            </w:pPr>
+            <w:r>
+              <w:rPr>
+                <w:rFonts w:ascii="Courier New" w:hAnsi="Courier New" w:cs="Courier New"/>
+                <w:sz w:val="20"/>
+                <w:szCs w:val="20"/>
+              </w:rPr>
+              <w:t xml:space="preserve">            R[k] = R[k] + x[m] * x[m+k]</w:t>
             </w:r>
           </w:p>
           <w:p>
@@ -3056,7 +3146,7 @@
               <w:spacing w:before="0" w:after="80"/>
             </w:pPr>
             <w:r>
-              <w:t xml:space="preserve">Interfața este în fișierul GUI_lab2.py (pornind de la GUI-ul din laboratorul 1).</w:t>
+              <w:t xml:space="preserve">Codul interfeței: GUI_ex4.py.</w:t>
             </w:r>
           </w:p>
           <w:p>
@@ -3065,7 +3155,7 @@
               <w:spacing w:before="0" w:after="80"/>
             </w:pPr>
             <w:r>
-              <w:t xml:space="preserve">Pentru casa1.wav, fereastră de 20 ms, start „a” = 9600, start „s” = 10960: F0 ≈ 276 Hz → copil (copii 250 – 650 Hz).</w:t>
+              <w:t xml:space="preserve">Pentru casa1.wav (fereastră 20 ms, start a = 9600, start s = 10960): F0 = 275,9 Hz → copil.</w:t>
             </w:r>
           </w:p>
         </w:tc>

</xml_diff>

<commit_message>
IOM lab 2: add exercise 5 with the student's own recording
Co-Authored-By: Claude Opus 5.5 <noreply@anthropic.com>
Claude-Session: https://claude.ai/code/session_01A12TLfEZbTus2PcwqKDioh
</commit_message>
<xml_diff>
--- a/iom/lab2/L2_TimpScurt.docx
+++ b/iom/lab2/L2_TimpScurt.docx
@@ -3274,28 +3274,47 @@
           </w:tcPr>
           <w:p>
             <w:pPr>
-              <w:pStyle w:val="Heading2"/>
-              <w:numPr>
-                <w:ilvl w:val="0"/>
-                <w:numId w:val="0"/>
-              </w:numPr>
-              <w:snapToGrid w:val="false"/>
-              <w:spacing w:lineRule="auto" w:line="240" w:before="40" w:after="0"/>
-              <w:ind w:hanging="576" w:start="576" w:end="0"/>
-              <w:rPr>
-                <w:rFonts w:ascii="Calibri" w:hAnsi="Calibri" w:cs="Calibri"/>
-                <w:color w:val="000000"/>
-                <w:sz w:val="24"/>
-                <w:szCs w:val="24"/>
-              </w:rPr>
-            </w:pPr>
-            <w:r>
-              <w:rPr>
-                <w:rFonts w:cs="Calibri" w:ascii="Calibri" w:hAnsi="Calibri"/>
-                <w:color w:val="000000"/>
-                <w:sz w:val="24"/>
-                <w:szCs w:val="24"/>
-              </w:rPr>
+              <w:pStyle w:val="Normal"/>
+              <w:spacing w:before="0" w:after="80"/>
+            </w:pPr>
+            <w:r>
+              <w:t xml:space="preserve">Semnal propriu: semnale/semnal_propriu.wav („casă”, 8000 Hz, mono, 16 biți).</w:t>
+            </w:r>
+          </w:p>
+          <w:p>
+            <w:pPr>
+              <w:pStyle w:val="Normal"/>
+              <w:spacing w:before="0" w:after="80"/>
+            </w:pPr>
+            <w:r>
+              <w:t xml:space="preserve">Start A: 7600, Stop A: 7760; Start S: 8840, Stop S: 9000</w:t>
+            </w:r>
+          </w:p>
+          <w:p>
+            <w:pPr>
+              <w:pStyle w:val="Normal"/>
+              <w:spacing w:before="0" w:after="80"/>
+            </w:pPr>
+            <w:r>
+              <w:t xml:space="preserve">Ea = 15,20 ; Za = 0,231 ; Ra = maxim la k = 42 → F0 = 8000/42 ≈ 190 Hz;</w:t>
+            </w:r>
+          </w:p>
+          <w:p>
+            <w:pPr>
+              <w:pStyle w:val="Normal"/>
+              <w:spacing w:before="0" w:after="80"/>
+            </w:pPr>
+            <w:r>
+              <w:t xml:space="preserve">Es = 0,0037 ; Zs = 0,294 ; Rs = fără maxime clare (fonem nesonor);</w:t>
+            </w:r>
+          </w:p>
+          <w:p>
+            <w:pPr>
+              <w:pStyle w:val="Normal"/>
+              <w:spacing w:before="0" w:after="80"/>
+            </w:pPr>
+            <w:r>
+              <w:t xml:space="preserve">Din GUI_ex4.py: F0 = 190,5 Hz → vorbitor de sex feminin.</w:t>
             </w:r>
           </w:p>
         </w:tc>

</xml_diff>

<commit_message>
IOM lab 2: add a note about the speaker classification in exercise 5
Co-Authored-By: Claude Opus 5.5 <noreply@anthropic.com>
Claude-Session: https://claude.ai/code/session_01A12TLfEZbTus2PcwqKDioh
</commit_message>
<xml_diff>
--- a/iom/lab2/L2_TimpScurt.docx
+++ b/iom/lab2/L2_TimpScurt.docx
@@ -3315,6 +3315,15 @@
             </w:pPr>
             <w:r>
               <w:t xml:space="preserve">Din GUI_ex4.py: F0 = 190,5 Hz → vorbitor de sex feminin.</w:t>
+            </w:r>
+          </w:p>
+          <w:p>
+            <w:pPr>
+              <w:pStyle w:val="Normal"/>
+              <w:spacing w:before="0" w:after="80"/>
+            </w:pPr>
+            <w:r>
+              <w:t xml:space="preserve">Observație: deși sunt băiat, cu F0 = 190 Hz algoritmul m-a trecut la sex feminin. Data viitoare înregistrez cu o voce mai gravă.</w:t>
             </w:r>
           </w:p>
         </w:tc>

</xml_diff>

<commit_message>
IOM lab 2: shorten the note in exercise 5
Co-Authored-By: Claude Opus 5.5 <noreply@anthropic.com>
Claude-Session: https://claude.ai/code/session_01A12TLfEZbTus2PcwqKDioh
</commit_message>
<xml_diff>
--- a/iom/lab2/L2_TimpScurt.docx
+++ b/iom/lab2/L2_TimpScurt.docx
@@ -3314,16 +3314,7 @@
               <w:spacing w:before="0" w:after="80"/>
             </w:pPr>
             <w:r>
-              <w:t xml:space="preserve">Din GUI_ex4.py: F0 = 190,5 Hz → vorbitor de sex feminin.</w:t>
-            </w:r>
-          </w:p>
-          <w:p>
-            <w:pPr>
-              <w:pStyle w:val="Normal"/>
-              <w:spacing w:before="0" w:after="80"/>
-            </w:pPr>
-            <w:r>
-              <w:t xml:space="preserve">Observație: deși sunt băiat, cu F0 = 190 Hz algoritmul m-a trecut la sex feminin. Data viitoare înregistrez cu o voce mai gravă.</w:t>
+              <w:t xml:space="preserve">Din GUI_ex4.py: F0 = 190,5 Hz → vorbitor de sex feminin (nu sunt, promit).</w:t>
             </w:r>
           </w:p>
         </w:tc>

</xml_diff>